<commit_message>
test: agregar video y evidencias exploratorias F06-F09
</commit_message>
<xml_diff>
--- a/reportes/defectos/Reporte_Defecto_DR-001_TC-N04.docx
+++ b/reportes/defectos/Reporte_Defecto_DR-001_TC-N04.docx
@@ -502,6 +502,7 @@
                 <w:szCs w:val="24"/>
               </w:rPr>
             </w:pPr>
+            <w:proofErr w:type="spellStart"/>
             <w:r>
               <w:rPr>
                 <w:rFonts w:ascii="Times New Roman" w:hAnsi="Times New Roman" w:cs="Times New Roman"/>
@@ -510,6 +511,7 @@
               </w:rPr>
               <w:t>Severidad</w:t>
             </w:r>
+            <w:proofErr w:type="spellEnd"/>
           </w:p>
         </w:tc>
         <w:tc>
@@ -565,6 +567,7 @@
                 <w:szCs w:val="24"/>
               </w:rPr>
             </w:pPr>
+            <w:proofErr w:type="spellStart"/>
             <w:r>
               <w:rPr>
                 <w:rFonts w:ascii="Times New Roman" w:hAnsi="Times New Roman" w:cs="Times New Roman"/>
@@ -573,6 +576,7 @@
               </w:rPr>
               <w:t>Prioridad</w:t>
             </w:r>
+            <w:proofErr w:type="spellEnd"/>
           </w:p>
         </w:tc>
         <w:tc>
@@ -628,6 +632,7 @@
                 <w:szCs w:val="24"/>
               </w:rPr>
             </w:pPr>
+            <w:proofErr w:type="spellStart"/>
             <w:r>
               <w:rPr>
                 <w:rFonts w:ascii="Times New Roman" w:hAnsi="Times New Roman" w:cs="Times New Roman"/>
@@ -636,6 +641,7 @@
               </w:rPr>
               <w:t>Ambiente</w:t>
             </w:r>
+            <w:proofErr w:type="spellEnd"/>
           </w:p>
         </w:tc>
         <w:tc>
@@ -792,7 +798,7 @@
                 <w:szCs w:val="24"/>
                 <w:lang w:val="es-GT"/>
               </w:rPr>
-              <w:t>Equipo de desarrollo de OpenCart Demo / pendiente de asignación</w:t>
+              <w:t xml:space="preserve">Equipo de desarrollo de OpenCart Demo </w:t>
             </w:r>
           </w:p>
         </w:tc>
@@ -850,15 +856,170 @@
                 <w:lang w:val="es-GT"/>
               </w:rPr>
             </w:pPr>
-            <w:r>
-              <w:rPr>
-                <w:rFonts w:ascii="Times New Roman" w:hAnsi="Times New Roman" w:cs="Times New Roman"/>
-                <w:sz w:val="24"/>
-                <w:szCs w:val="24"/>
-                <w:lang w:val="es-GT"/>
-              </w:rPr>
-              <w:t>Pendiente de crear en GitHub</w:t>
-            </w:r>
+            <w:hyperlink r:id="rId6" w:history="1">
+              <w:r>
+                <w:rPr>
+                  <w:rStyle w:val="Hipervnculo"/>
+                  <w:rFonts w:ascii="Times New Roman" w:hAnsi="Times New Roman" w:cs="Times New Roman"/>
+                  <w:sz w:val="24"/>
+                  <w:szCs w:val="24"/>
+                  <w:lang w:val="es-GT"/>
+                </w:rPr>
+                <w:t>[DR-001] La búsqueda sin coincidencias muestra "</w:t>
+              </w:r>
+              <w:proofErr w:type="spellStart"/>
+              <w:r>
+                <w:rPr>
+                  <w:rStyle w:val="Hipervnculo"/>
+                  <w:rFonts w:ascii="Times New Roman" w:hAnsi="Times New Roman" w:cs="Times New Roman"/>
+                  <w:sz w:val="24"/>
+                  <w:szCs w:val="24"/>
+                  <w:lang w:val="es-GT"/>
+                </w:rPr>
+                <w:t>Your</w:t>
+              </w:r>
+              <w:proofErr w:type="spellEnd"/>
+              <w:r>
+                <w:rPr>
+                  <w:rStyle w:val="Hipervnculo"/>
+                  <w:rFonts w:ascii="Times New Roman" w:hAnsi="Times New Roman" w:cs="Times New Roman"/>
+                  <w:sz w:val="24"/>
+                  <w:szCs w:val="24"/>
+                  <w:lang w:val="es-GT"/>
+                </w:rPr>
+                <w:t xml:space="preserve"> shop</w:t>
+              </w:r>
+              <w:r>
+                <w:rPr>
+                  <w:rStyle w:val="Hipervnculo"/>
+                  <w:rFonts w:ascii="Times New Roman" w:hAnsi="Times New Roman" w:cs="Times New Roman"/>
+                  <w:sz w:val="24"/>
+                  <w:szCs w:val="24"/>
+                  <w:lang w:val="es-GT"/>
+                </w:rPr>
+                <w:t>p</w:t>
+              </w:r>
+              <w:r>
+                <w:rPr>
+                  <w:rStyle w:val="Hipervnculo"/>
+                  <w:rFonts w:ascii="Times New Roman" w:hAnsi="Times New Roman" w:cs="Times New Roman"/>
+                  <w:sz w:val="24"/>
+                  <w:szCs w:val="24"/>
+                  <w:lang w:val="es-GT"/>
+                </w:rPr>
+                <w:t xml:space="preserve">ing </w:t>
+              </w:r>
+              <w:proofErr w:type="spellStart"/>
+              <w:r>
+                <w:rPr>
+                  <w:rStyle w:val="Hipervnculo"/>
+                  <w:rFonts w:ascii="Times New Roman" w:hAnsi="Times New Roman" w:cs="Times New Roman"/>
+                  <w:sz w:val="24"/>
+                  <w:szCs w:val="24"/>
+                  <w:lang w:val="es-GT"/>
+                </w:rPr>
+                <w:t>cart</w:t>
+              </w:r>
+              <w:proofErr w:type="spellEnd"/>
+              <w:r>
+                <w:rPr>
+                  <w:rStyle w:val="Hipervnculo"/>
+                  <w:rFonts w:ascii="Times New Roman" w:hAnsi="Times New Roman" w:cs="Times New Roman"/>
+                  <w:sz w:val="24"/>
+                  <w:szCs w:val="24"/>
+                  <w:lang w:val="es-GT"/>
+                </w:rPr>
+                <w:t xml:space="preserve"> </w:t>
+              </w:r>
+              <w:proofErr w:type="spellStart"/>
+              <w:r>
+                <w:rPr>
+                  <w:rStyle w:val="Hipervnculo"/>
+                  <w:rFonts w:ascii="Times New Roman" w:hAnsi="Times New Roman" w:cs="Times New Roman"/>
+                  <w:sz w:val="24"/>
+                  <w:szCs w:val="24"/>
+                  <w:lang w:val="es-GT"/>
+                </w:rPr>
+                <w:t>is</w:t>
+              </w:r>
+              <w:proofErr w:type="spellEnd"/>
+              <w:r>
+                <w:rPr>
+                  <w:rStyle w:val="Hipervnculo"/>
+                  <w:rFonts w:ascii="Times New Roman" w:hAnsi="Times New Roman" w:cs="Times New Roman"/>
+                  <w:sz w:val="24"/>
+                  <w:szCs w:val="24"/>
+                  <w:lang w:val="es-GT"/>
+                </w:rPr>
+                <w:t xml:space="preserve"> </w:t>
+              </w:r>
+              <w:proofErr w:type="spellStart"/>
+              <w:r>
+                <w:rPr>
+                  <w:rStyle w:val="Hipervnculo"/>
+                  <w:rFonts w:ascii="Times New Roman" w:hAnsi="Times New Roman" w:cs="Times New Roman"/>
+                  <w:sz w:val="24"/>
+                  <w:szCs w:val="24"/>
+                  <w:lang w:val="es-GT"/>
+                </w:rPr>
+                <w:t>empty</w:t>
+              </w:r>
+              <w:proofErr w:type="spellEnd"/>
+              <w:r>
+                <w:rPr>
+                  <w:rStyle w:val="Hipervnculo"/>
+                  <w:rFonts w:ascii="Times New Roman" w:hAnsi="Times New Roman" w:cs="Times New Roman"/>
+                  <w:sz w:val="24"/>
+                  <w:szCs w:val="24"/>
+                  <w:lang w:val="es-GT"/>
+                </w:rPr>
+                <w:t xml:space="preserve">!" en lugar del mensaje de búsqueda · </w:t>
+              </w:r>
+              <w:proofErr w:type="spellStart"/>
+              <w:r>
+                <w:rPr>
+                  <w:rStyle w:val="Hipervnculo"/>
+                  <w:rFonts w:ascii="Times New Roman" w:hAnsi="Times New Roman" w:cs="Times New Roman"/>
+                  <w:sz w:val="24"/>
+                  <w:szCs w:val="24"/>
+                  <w:lang w:val="es-GT"/>
+                </w:rPr>
+                <w:t>Issue</w:t>
+              </w:r>
+              <w:proofErr w:type="spellEnd"/>
+              <w:r>
+                <w:rPr>
+                  <w:rStyle w:val="Hipervnculo"/>
+                  <w:rFonts w:ascii="Times New Roman" w:hAnsi="Times New Roman" w:cs="Times New Roman"/>
+                  <w:sz w:val="24"/>
+                  <w:szCs w:val="24"/>
+                  <w:lang w:val="es-GT"/>
+                </w:rPr>
+                <w:t xml:space="preserve"> #3 · </w:t>
+              </w:r>
+              <w:proofErr w:type="spellStart"/>
+              <w:r>
+                <w:rPr>
+                  <w:rStyle w:val="Hipervnculo"/>
+                  <w:rFonts w:ascii="Times New Roman" w:hAnsi="Times New Roman" w:cs="Times New Roman"/>
+                  <w:sz w:val="24"/>
+                  <w:szCs w:val="24"/>
+                  <w:lang w:val="es-GT"/>
+                </w:rPr>
+                <w:t>leotedd</w:t>
+              </w:r>
+              <w:proofErr w:type="spellEnd"/>
+              <w:r>
+                <w:rPr>
+                  <w:rStyle w:val="Hipervnculo"/>
+                  <w:rFonts w:ascii="Times New Roman" w:hAnsi="Times New Roman" w:cs="Times New Roman"/>
+                  <w:sz w:val="24"/>
+                  <w:szCs w:val="24"/>
+                  <w:lang w:val="es-GT"/>
+                </w:rPr>
+                <w:t>/Proyecto-QA-Tienda</w:t>
+              </w:r>
+            </w:hyperlink>
           </w:p>
         </w:tc>
       </w:tr>
@@ -1206,7 +1367,7 @@
                     <pic:cNvPicPr/>
                   </pic:nvPicPr>
                   <pic:blipFill>
-                    <a:blip r:embed="rId6"/>
+                    <a:blip r:embed="rId7"/>
                     <a:stretch>
                       <a:fillRect/>
                     </a:stretch>
@@ -2073,7 +2234,6 @@
   <w:style w:type="character" w:default="1" w:styleId="Fuentedeprrafopredeter">
     <w:name w:val="Default Paragraph Font"/>
     <w:uiPriority w:val="1"/>
-    <w:semiHidden/>
     <w:unhideWhenUsed/>
   </w:style>
   <w:style w:type="table" w:default="1" w:styleId="Tablanormal">
@@ -12849,6 +13009,41 @@
         <w:shd w:val="clear" w:color="auto" w:fill="FBCAA2" w:themeFill="accent6" w:themeFillTint="7F"/>
       </w:tcPr>
     </w:tblStylePr>
+  </w:style>
+  <w:style w:type="character" w:styleId="Hipervnculo">
+    <w:name w:val="Hyperlink"/>
+    <w:basedOn w:val="Fuentedeprrafopredeter"/>
+    <w:uiPriority w:val="99"/>
+    <w:unhideWhenUsed/>
+    <w:rsid w:val="00741937"/>
+    <w:rPr>
+      <w:color w:val="0000FF" w:themeColor="hyperlink"/>
+      <w:u w:val="single"/>
+    </w:rPr>
+  </w:style>
+  <w:style w:type="character" w:styleId="Mencinsinresolver">
+    <w:name w:val="Unresolved Mention"/>
+    <w:basedOn w:val="Fuentedeprrafopredeter"/>
+    <w:uiPriority w:val="99"/>
+    <w:semiHidden/>
+    <w:unhideWhenUsed/>
+    <w:rsid w:val="00741937"/>
+    <w:rPr>
+      <w:color w:val="605E5C"/>
+      <w:shd w:val="clear" w:color="auto" w:fill="E1DFDD"/>
+    </w:rPr>
+  </w:style>
+  <w:style w:type="character" w:styleId="Hipervnculovisitado">
+    <w:name w:val="FollowedHyperlink"/>
+    <w:basedOn w:val="Fuentedeprrafopredeter"/>
+    <w:uiPriority w:val="99"/>
+    <w:semiHidden/>
+    <w:unhideWhenUsed/>
+    <w:rsid w:val="00741937"/>
+    <w:rPr>
+      <w:color w:val="800080" w:themeColor="followedHyperlink"/>
+      <w:u w:val="single"/>
+    </w:rPr>
   </w:style>
 </w:styles>
 </file>

</xml_diff>